<commit_message>
登记 DD-70 / DD-71 与 IR-47 / IR-48
DD-70 发布形态：Ansible 剧本为权威来源，虚机镜像只能是剧本的派生产物；
离网介质自带 apt / PyPI / 容器三个仓库；构建期依赖不进墙内。
被拒绝方案里记下了「以镜像为交付物」的三条独立否决理由，其中第三条是
分发镜像会使我方成为 GPL 二进制的分发者（GPLv2 §3 / v3 §6），凭空产生
八年期的「提供对应源码」义务——交付剧本与校验和则什么都没分发。

DD-71 容器镜像跨墙用 skopeo + OCI 目录，复验锚点落在介质上的 manifest
而非本机镜像库；podman save/load 不保 digest（2026-10-08 实测，load 直接
拒绝）记入被拒绝方案。

IR-47 虚机按什么基线交付（决定 apt 闭包按什么底座解析，也决定能否发镜像）。
IR-48 介质导入流程，含「病毒扫描网关是否改写文件」——网关若重新打包压缩
文件，我方签名的 SHA256SUMS 与镜像 digest 复验会全部失败。建议正式交付前
做一次小样试导。

顺带修掉 HD-03 紧急度汇总表里一处陈旧计数（高 28 实际 31，现为 33），
并把正文的「共 45 项」更正为 48 项。

check_refs.py：悬空引用 0；CN 37 / DD 71 / AS 31 / IR 48 均无断号。

Co-Authored-By: Claude Opus 5 <noreply@anthropic.com>
Claude-Session: https://claude.ai/code/session_01MzPePSHWkTUSpnMTsqY5pZ
</commit_message>
<xml_diff>
--- a/HD-03_假设与信息需求登记册.docx
+++ b/HD-03_假设与信息需求登记册.docx
@@ -3487,7 +3487,7 @@
           <w:b w:val="0"/>
           <w:sz w:val="21"/>
         </w:rPr>
-        <w:t>共 45 项（其中 IR-32 已关闭）。紧急度为“高”的项目，其答复会改变设计选择、交付范围或承诺内容，应在设计冻结前取得。</w:t>
+        <w:t>共 48 项（其中 IR-32 已关闭、IR-13 部分已答复）。紧急度为“高”的项目，其答复会改变设计选择、交付范围或承诺内容，应在设计冻结前取得。IR-47 与 IR-48 为 2026-10 新增，二者同在交付的关键路径上：答复未到之前，离网介质的组织方式不能定稿。</w:t>
       </w:r>
     </w:p>
     <w:tbl>
@@ -3608,7 +3608,7 @@
               <w:spacing w:after="40" w:before="40" w:line="283" w:lineRule="auto"/>
             </w:pPr>
             <w:r>
-              <w:t>28</w:t>
+              <w:t>33</w:t>
             </w:r>
           </w:p>
         </w:tc>
@@ -3660,14 +3660,8 @@
             <w:pPr>
               <w:spacing w:after="40" w:before="40" w:line="283" w:lineRule="auto"/>
             </w:pPr>
-            <w:r/>
-            <w:r>
-              <w:rPr>
-                <w:rFonts w:ascii="微软雅黑" w:hAnsi="微软雅黑" w:eastAsia="微软雅黑"/>
-                <w:b w:val="0"/>
-                <w:sz w:val="18"/>
-              </w:rPr>
-              <w:t>13</w:t>
+            <w:r>
+              <w:t>12</w:t>
             </w:r>
           </w:p>
         </w:tc>
@@ -3719,13 +3713,7 @@
             <w:pPr>
               <w:spacing w:after="40" w:before="40" w:line="283" w:lineRule="auto"/>
             </w:pPr>
-            <w:r/>
-            <w:r>
-              <w:rPr>
-                <w:rFonts w:ascii="微软雅黑" w:hAnsi="微软雅黑" w:eastAsia="微软雅黑"/>
-                <w:b w:val="0"/>
-                <w:sz w:val="18"/>
-              </w:rPr>
+            <w:r>
               <w:t>1</w:t>
             </w:r>
           </w:p>
@@ -8335,6 +8323,140 @@
             </w:pPr>
             <w:r>
               <w:t>随 ICP 接口联调提出；主叫号码一项可直接用一天的话单样本看出来。</w:t>
+            </w:r>
+          </w:p>
+        </w:tc>
+      </w:tr>
+      <w:tr>
+        <w:tc>
+          <w:tcPr>
+            <w:tcW w:type="dxa" w:w="1077"/>
+          </w:tcPr>
+          <w:p>
+            <w:pPr>
+              <w:spacing w:after="40" w:before="40" w:line="283" w:lineRule="auto"/>
+            </w:pPr>
+            <w:r>
+              <w:t>IR-47  高</w:t>
+            </w:r>
+          </w:p>
+        </w:tc>
+        <w:tc>
+          <w:tcPr>
+            <w:tcW w:type="dxa" w:w="2381"/>
+          </w:tcPr>
+          <w:p>
+            <w:pPr>
+              <w:spacing w:after="40" w:before="40" w:line="283" w:lineRule="auto"/>
+            </w:pPr>
+            <w:r>
+              <w:t>生产虚机按什么基线交付：是总包商/MOI 的标准化基线镜像（含安全加固策略、备份代理、监控代理、域加入、补丁通道），还是按 ISO 全新安装的裸机？若为标准基线，需取得其已装包清单。</w:t>
+            </w:r>
+          </w:p>
+        </w:tc>
+        <w:tc>
+          <w:tcPr>
+            <w:tcW w:type="dxa" w:w="1077"/>
+          </w:tcPr>
+          <w:p>
+            <w:pPr>
+              <w:spacing w:after="40" w:before="40" w:line="283" w:lineRule="auto"/>
+            </w:pPr>
+            <w:r>
+              <w:t>MOI / 总包商</w:t>
+            </w:r>
+          </w:p>
+        </w:tc>
+        <w:tc>
+          <w:tcPr>
+            <w:tcW w:type="dxa" w:w="2608"/>
+          </w:tcPr>
+          <w:p>
+            <w:pPr>
+              <w:spacing w:after="40" w:before="40" w:line="283" w:lineRule="auto"/>
+            </w:pPr>
+            <w:r>
+              <w:t>决定两件事。一、离网介质中 apt 依赖闭包按什么底座解析——`apt-get --print-uris` 只列出当前机器还缺的包，底座不同闭包就不完整，而这种缺失只会在现场装机时才暴露。二、我方能否以虚机镜像形态交付（若平台有自己的基线与补丁通道，自制镜像不可能通过安全审计）。阻塞 runbook/90 的介质定稿。</w:t>
+            </w:r>
+          </w:p>
+        </w:tc>
+        <w:tc>
+          <w:tcPr>
+            <w:tcW w:type="dxa" w:w="1701"/>
+          </w:tcPr>
+          <w:p>
+            <w:pPr>
+              <w:spacing w:after="40" w:before="40" w:line="283" w:lineRule="auto"/>
+            </w:pPr>
+            <w:r>
+              <w:t>随介质导入流程（IR-48）一并向总包商提出。若给出标准基线，请一并提供 `dpkg-query -W` 的输出，我方据此重算闭包。</w:t>
+            </w:r>
+          </w:p>
+        </w:tc>
+      </w:tr>
+      <w:tr>
+        <w:tc>
+          <w:tcPr>
+            <w:tcW w:type="dxa" w:w="1077"/>
+          </w:tcPr>
+          <w:p>
+            <w:pPr>
+              <w:spacing w:after="40" w:before="40" w:line="283" w:lineRule="auto"/>
+            </w:pPr>
+            <w:r>
+              <w:t>IR-48  高</w:t>
+            </w:r>
+          </w:p>
+        </w:tc>
+        <w:tc>
+          <w:tcPr>
+            <w:tcW w:type="dxa" w:w="2381"/>
+          </w:tcPr>
+          <w:p>
+            <w:pPr>
+              <w:spacing w:after="40" w:before="40" w:line="283" w:lineRule="auto"/>
+            </w:pPr>
+            <w:r>
+              <w:t>离网介质的导入流程：允许的介质形态与数量、单次体积上限、报批提前期、现场由谁执行；以及**病毒扫描网关是否会改写文件内容**（例如将压缩包解开后重新打包）。</w:t>
+            </w:r>
+          </w:p>
+        </w:tc>
+        <w:tc>
+          <w:tcPr>
+            <w:tcW w:type="dxa" w:w="1077"/>
+          </w:tcPr>
+          <w:p>
+            <w:pPr>
+              <w:spacing w:after="40" w:before="40" w:line="283" w:lineRule="auto"/>
+            </w:pPr>
+            <w:r>
+              <w:t>MOI / 总包商</w:t>
+            </w:r>
+          </w:p>
+        </w:tc>
+        <w:tc>
+          <w:tcPr>
+            <w:tcW w:type="dxa" w:w="2608"/>
+          </w:tcPr>
+          <w:p>
+            <w:pPr>
+              <w:spacing w:after="40" w:before="40" w:line="283" w:lineRule="auto"/>
+            </w:pPr>
+            <w:r>
+              <w:t>MOI 内网没有 apt / PyPI / 容器镜像仓库，全部物料须由介质携带（runbook/90）。扫描网关若重新打包压缩文件，字节即发生变化，我方签名的 SHA256SUMS 与容器镜像的 digest 复验会全部失败——而这类问题在现场才发现通常要花数天。体积上限与报批提前期决定介质如何切分与何时送审。</w:t>
+            </w:r>
+          </w:p>
+        </w:tc>
+        <w:tc>
+          <w:tcPr>
+            <w:tcW w:type="dxa" w:w="1701"/>
+          </w:tcPr>
+          <w:p>
+            <w:pPr>
+              <w:spacing w:after="40" w:before="40" w:line="283" w:lineRule="auto"/>
+            </w:pPr>
+            <w:r>
+              <w:t>书面提出，并请求在正式交付前做一次**小样试导**（几十 MB 的测试目录加 SHA256SUMS），用实际结果确认校验和能否穿过网关。</w:t>
             </w:r>
           </w:p>
         </w:tc>

</xml_diff>

<commit_message>
DD-91 core 装载规则十二处、DD-92 caller_number_hash；LD-02 第 3 章补充段；LD-10 用例改号 TC-DISC-19/20/21；AS-32/33 更正；NOTES 回复 dbt 方案
Co-Authored-By: Claude Fable 5.1 <noreply@anthropic.com>
Claude-Session: https://claude.ai/code/session_01MzPePSHWkTUSpnMTsqY5pZ
</commit_message>
<xml_diff>
--- a/HD-03_假设与信息需求登记册.docx
+++ b/HD-03_假设与信息需求登记册.docx
@@ -3491,7 +3491,7 @@
               <w:spacing w:after="40" w:before="40" w:line="283" w:lineRule="auto"/>
             </w:pPr>
             <w:r>
-              <w:t>假接口中凡照文档推测的行为（共 19 条，见 NOTES.md 2026-10-13 一节，核实结论回写契约 if03a 的 integration_checks 段），与真实平台不同者，联调时都须改接入程序。其中时区、窗口边界、单次返回是否静默截断、CALLID 的唯一范围四条不报错、只少数据或错位，联调时须逐条主动核实，不能以「跑通了」为准。合成数据只用于验证代码路径，不得用于性能结论或指标口径结论。</w:t>
+              <w:t>假接口中凡照文档推测的行为（共 19 条，见 NOTES.md 2026-10-13 一节，核实结论回写契约 if03a（if03d 已有 integration_checks 段，if03a 须按同一格式增设该段后回写）），与真实平台不同者，联调时都须改接入程序。其中时区、窗口边界、单次返回是否静默截断、CALLID 的唯一范围四条不报错、只少数据或错位，联调时须逐条主动核实，不能以「跑通了」为准。合成数据只用于验证代码路径，不得用于性能结论或指标口径结论。</w:t>
             </w:r>
           </w:p>
         </w:tc>
@@ -3551,7 +3551,7 @@
               <w:spacing w:after="40" w:before="40" w:line="283" w:lineRule="auto"/>
             </w:pPr>
             <w:r>
-              <w:t>若会改号，(CALLID, CALLIDNUM) 作幂等键会把同一段通话记成两段、或把两段合成一段；「通话是否结束」的判断（是否已见 -1）要改。已列入 ICP 问题单 Q22。</w:t>
+              <w:t>若会改号，(CALLID, CALLIDNUM) 作幂等键会把同一段通话记成两段、或把两段合成一段；「通话是否结束」的判断（是否已见 -1）要改。已列入 ICP 问题单 Q21。</w:t>
             </w:r>
           </w:p>
         </w:tc>

</xml_diff>